<commit_message>
docs: update examiner presentation guide Word document with E-002 JOIN Query details
</commit_message>
<xml_diff>
--- a/docs/Harbinger_Dashboard_Explanation.docx
+++ b/docs/Harbinger_Dashboard_Explanation.docx
@@ -92,7 +92,52 @@
           <w:color w:val="0A2540"/>
           <w:sz w:val="36"/>
         </w:rPr>
-        <w:t>2. Explaining the Core Metric Cards</w:t>
+        <w:t>2. Benchmark Profiles: Single vs. Multi-Table (JOIN) Queries</w:t>
+      </w:r>
+    </w:p>
+    <w:p>
+      <w:pPr>
+        <w:spacing w:after="240"/>
+      </w:pPr>
+      <w:r>
+        <w:t>Harbinger supports two benchmark query setups to demonstrate planner behavior:</w:t>
+        <w:br/>
+        <w:br/>
+        <w:t>Profile E-001 (Single Table Query):</w:t>
+        <w:br/>
+        <w:t>Runs on the harbinger_lab.orders table (100k rows) checking status = 'pending'. Examines how index scan performance degrades silently before plan transitions.</w:t>
+        <w:br/>
+        <w:br/>
+        <w:t>Profile E-002 (Multi-Table JOIN Query - Phase 4):</w:t>
+        <w:br/>
+        <w:t>Extends the query to join orders with the new customers table (10k rows) matching customer_id:</w:t>
+        <w:br/>
+        <w:t xml:space="preserve">  SELECT o.order_id, c.customer_name, c.customer_tier, o.order_amount</w:t>
+        <w:br/>
+        <w:t xml:space="preserve">  FROM harbinger_lab.orders o</w:t>
+        <w:br/>
+        <w:t xml:space="preserve">  JOIN harbinger_lab.customers c ON o.customer_id = c.customer_id</w:t>
+        <w:br/>
+        <w:t xml:space="preserve">  WHERE o.status = 'pending';</w:t>
+        <w:br/>
+        <w:br/>
+        <w:t>Demonstrates the planner's transition from Nested Loop joins (index lookup per matching row) to Hash/Merge joins (sequential scans on both tables) when selectivity becomes high (50%+).</w:t>
+      </w:r>
+    </w:p>
+    <w:p>
+      <w:pPr>
+        <w:pStyle w:val="Heading1"/>
+        <w:keepNext/>
+        <w:spacing w:before="240" w:after="120"/>
+      </w:pPr>
+      <w:r>
+        <w:rPr>
+          <w:rFonts w:ascii="Arial" w:hAnsi="Arial"/>
+          <w:b/>
+          <w:color w:val="0A2540"/>
+          <w:sz w:val="36"/>
+        </w:rPr>
+        <w:t>3. Explaining the Core Metric Cards</w:t>
       </w:r>
     </w:p>
     <w:p>
@@ -149,7 +194,7 @@
       <w:r>
         <w:t>What it is:</w:t>
         <w:br/>
-        <w:t>This shows the selectivity percentage where the PostgreSQL query planner abandons the baseline execution strategy (Index Scan) and switches to another strategy (Sequential Scan). It also explicitly displays the plan name in brackets e.g., 50% (Seq Scan).</w:t>
+        <w:t>This shows the selectivity percentage where the PostgreSQL query planner abandons the baseline execution strategy (Index Scan) and switches to another strategy (e.g., Sequential Scan or Hash Join). It also explicitly displays the plan name in brackets e.g., 50% (Seq Scan) or 50% (Hash Join).</w:t>
         <w:br/>
         <w:br/>
         <w:t>How to explain to the guide:</w:t>
@@ -237,7 +282,7 @@
           <w:color w:val="0A2540"/>
           <w:sz w:val="36"/>
         </w:rPr>
-        <w:t>3. Explaining the Sidebar Sliders &amp; Controls</w:t>
+        <w:t>4. Explaining the Sidebar Sliders &amp; Controls</w:t>
       </w:r>
     </w:p>
     <w:p>
@@ -257,7 +302,7 @@
         <w:br/>
         <w:t>3. Selectivity Range Checklist:</w:t>
         <w:br/>
-        <w:t>Choose which future states you want to simulate (e.g. 5%, 15%, 50%, 75%).</w:t>
+        <w:t>Choose which future states you want to simulate (e.g. 5%, 15%, 50%, 75%, 100%).</w:t>
         <w:br/>
         <w:br/>
         <w:t>4. Execute Sweep Button:</w:t>
@@ -278,7 +323,7 @@
           <w:color w:val="0A2540"/>
           <w:sz w:val="36"/>
         </w:rPr>
-        <w:t>4. Explaining the Chart &amp; Checkpoint Table</w:t>
+        <w:t>5. Explaining the Chart &amp; Checkpoint Table</w:t>
       </w:r>
     </w:p>
     <w:p>
@@ -294,14 +339,14 @@
         <w:br/>
         <w:t>- Red Dots highlight checkpoints where query speed has regressed past safety.</w:t>
         <w:br/>
-        <w:t>- Purple Dots highlight where the plan actually transitioned from Index Scan to Seq Scan.</w:t>
+        <w:t>- Purple Dots highlight where the plan actually transitioned from Index Scan to Seq Scan or Hash Join.</w:t>
         <w:br/>
         <w:br/>
         <w:t>Measurements Table:</w:t>
         <w:br/>
         <w:t>- Summarizes all numerical metrics for each simulated checkpoint.</w:t>
         <w:br/>
-        <w:t>- 'Query Plan' Column: Explicitly shows 'Index Scan' or 'Seq Scan' so examiners can see the exact swap point.</w:t>
+        <w:t>- 'Query Plan' Column: Explicitly shows 'Index Scan', 'Seq Scan', or 'Hash Join' so examiners can see the exact swap point.</w:t>
         <w:br/>
         <w:t>- 'Action Plan' Column: Provides rule-based recommendations (e.g. suggesting index tuning).</w:t>
       </w:r>
@@ -324,7 +369,7 @@
           <w:color w:val="0A2540"/>
           <w:sz w:val="36"/>
         </w:rPr>
-        <w:t>5. Critical Viva Q&amp;A — Preparing for Examiner Questions</w:t>
+        <w:t>6. Critical Viva Q&amp;A — Preparing for Examiner Questions</w:t>
       </w:r>
     </w:p>
     <w:p>
@@ -356,7 +401,7 @@
           <w:b/>
           <w:color w:val="0A2540"/>
         </w:rPr>
-        <w:t>Q2: What is the main research finding shown on the dashboard?</w:t>
+        <w:t>Q2: What is the difference in plan transition (PTT) between E-001 and E-002?</w:t>
       </w:r>
     </w:p>
     <w:p>
@@ -364,7 +409,7 @@
         <w:spacing w:after="240"/>
       </w:pPr>
       <w:r>
-        <w:t>Answer: "We have proved Case A. The query performance degrades at 20% selectivity (FT_runtime), but the planner keeps using the Index Scan until 50% selectivity (PTT). This means the query slows down before the plan switches, showing that monitoring plan-type changes alone fails to detect regressions."</w:t>
+        <w:t>Answer: "In the single table query (E-001), PTT tracks the transition from an Index Scan on orders to a Full Table Sequential Scan. In the JOIN query (E-002), PTT tracks how the join method itself changes from a Nested Loop (index looking up customers row-by-row) to a Hash Join (building a hash table of customers in memory and scanning both tables once), which is the standard optimizer choice for processing large subsets of matching data (50%+ selectivity)."</w:t>
       </w:r>
     </w:p>
     <w:p>

</xml_diff>